<commit_message>
Update draft document `Utkast_yttrande_over_bemotandet_KL_261021_kort.md` with refined arguments and requests from LNF regarding environmental assessments. Adjusted points for clarity and specificity, enhancing the document's comprehensiveness for the review process.
</commit_message>
<xml_diff>
--- a/Fritid/NF/Maxima/Yttrande/Utkast/Utkast_yttrande_over_bemotandet_KL_261021_kort.docx
+++ b/Fritid/NF/Maxima/Yttrande/Utkast/Utkast_yttrande_over_bemotandet_KL_261021_kort.docx
@@ -99,7 +99,7 @@
         <w:rPr>
           <w:b w:val="0"/>
         </w:rPr>
-        <w:t>att ansökan om MAXIMA avslås,</w:t>
+        <w:t>att ansökan om MAXIMA avslås, bland annat av de skäl som anges i punkt 1–8 nedan,</w:t>
       </w:r>
     </w:p>
     <w:p>
@@ -110,7 +110,7 @@
         <w:rPr>
           <w:b w:val="0"/>
         </w:rPr>
-        <w:t>att domstolen underkänner miljökonsekvensbeskrivningen (MKB), eftersom den är ofullständig och felaktig,</w:t>
+        <w:t>att domstolen underkänner miljökonsekvensbeskrivningen (MKB), eftersom den är ofullständig och felaktig, bland annat på de punkter som anges i punkt 1–6 nedan och i Bilagan,</w:t>
       </w:r>
     </w:p>
     <w:p>
@@ -121,7 +121,7 @@
         <w:rPr>
           <w:b w:val="0"/>
         </w:rPr>
-        <w:t>att verkställighetsförordnandet avslås.</w:t>
+        <w:t>att verkställighetsförordnandet avslås, se punkt 10.</w:t>
       </w:r>
     </w:p>
     <w:p>
@@ -129,7 +129,7 @@
         <w:rPr>
           <w:b w:val="0"/>
         </w:rPr>
-        <w:t>I andra hand, om domstolen inte avslår ansökan eller underkänner MKB:n nu, yrkar LNF att VA SYD föreläggs att komplettera MKB:n med de uppgifter som anges nedan. Övriga frågor som VA SYD inte har besvarat redovisas i Bilagan.</w:t>
+        <w:t>I andra hand, om domstolen inte avslår ansökan eller underkänner MKB:n nu, yrkar LNF att VA SYD föreläggs att komplettera MKB:n med de uppgifter som anges i punkt 1–7 och i Bilagan. Varje punkt anger vilken fråga och vilket lagrum den gäller, och slutar med vad LNF begär att VA SYD redovisar.</w:t>
       </w:r>
     </w:p>
     <w:p>

</xml_diff>

<commit_message>
Update draft documents and maxima.html for KL_261021
- Updated `Utkast_yttrande_over_bemotandet_KL_261021_kort.md` to include highlighted arguments supporting requests from LNF, enhancing clarity for review.
- Added a link to the Word version of the draft in `maxima.html`, providing users with easy access to both formats.
- Revised `README.md` to reflect the latest changes and the inclusion of the new draft details.
</commit_message>
<xml_diff>
--- a/Fritid/NF/Maxima/Yttrande/Utkast/Utkast_yttrande_over_bemotandet_KL_261021_kort.docx
+++ b/Fritid/NF/Maxima/Yttrande/Utkast/Utkast_yttrande_over_bemotandet_KL_261021_kort.docx
@@ -99,7 +99,20 @@
         <w:rPr>
           <w:b w:val="0"/>
         </w:rPr>
-        <w:t>att ansökan om MAXIMA avslås, bland annat av de skäl som anges i punkt 1–8 nedan,</w:t>
+        <w:t xml:space="preserve">att ansökan om MAXIMA avslås, </w:t>
+      </w:r>
+      <w:r>
+        <w:rPr>
+          <w:b w:val="0"/>
+          <w:highlight w:val="yellow"/>
+        </w:rPr>
+        <w:t>bland annat av de skäl som anges i punkt 1–8 nedan</w:t>
+      </w:r>
+      <w:r>
+        <w:rPr>
+          <w:b w:val="0"/>
+        </w:rPr>
+        <w:t>,</w:t>
       </w:r>
     </w:p>
     <w:p>
@@ -110,7 +123,20 @@
         <w:rPr>
           <w:b w:val="0"/>
         </w:rPr>
-        <w:t>att domstolen underkänner miljökonsekvensbeskrivningen (MKB), eftersom den är ofullständig och felaktig, bland annat på de punkter som anges i punkt 1–6 nedan och i Bilagan,</w:t>
+        <w:t xml:space="preserve">att domstolen underkänner miljökonsekvensbeskrivningen (MKB), eftersom den är ofullständig och felaktig, </w:t>
+      </w:r>
+      <w:r>
+        <w:rPr>
+          <w:b w:val="0"/>
+          <w:highlight w:val="yellow"/>
+        </w:rPr>
+        <w:t>bland annat på de punkter som anges i punkt 1–6 nedan och i Bilagan</w:t>
+      </w:r>
+      <w:r>
+        <w:rPr>
+          <w:b w:val="0"/>
+        </w:rPr>
+        <w:t>,</w:t>
       </w:r>
     </w:p>
     <w:p>
@@ -121,7 +147,20 @@
         <w:rPr>
           <w:b w:val="0"/>
         </w:rPr>
-        <w:t>att verkställighetsförordnandet avslås, se punkt 10.</w:t>
+        <w:t xml:space="preserve">att verkställighetsförordnandet avslås, </w:t>
+      </w:r>
+      <w:r>
+        <w:rPr>
+          <w:b w:val="0"/>
+          <w:highlight w:val="yellow"/>
+        </w:rPr>
+        <w:t>se punkt 10</w:t>
+      </w:r>
+      <w:r>
+        <w:rPr>
+          <w:b w:val="0"/>
+        </w:rPr>
+        <w:t>.</w:t>
       </w:r>
     </w:p>
     <w:p>
@@ -129,7 +168,27 @@
         <w:rPr>
           <w:b w:val="0"/>
         </w:rPr>
-        <w:t>I andra hand, om domstolen inte avslår ansökan eller underkänner MKB:n nu, yrkar LNF att VA SYD föreläggs att komplettera MKB:n med de uppgifter som anges i punkt 1–7 och i Bilagan. Varje punkt anger vilken fråga och vilket lagrum den gäller, och slutar med vad LNF begär att VA SYD redovisar.</w:t>
+        <w:t xml:space="preserve">I andra hand, om domstolen inte avslår ansökan eller underkänner MKB:n nu, yrkar LNF att VA SYD föreläggs att komplettera MKB:n med de uppgifter som anges i </w:t>
+      </w:r>
+      <w:r>
+        <w:rPr>
+          <w:b w:val="0"/>
+          <w:highlight w:val="yellow"/>
+        </w:rPr>
+        <w:t>punkt 1–7 och i Bilagan</w:t>
+      </w:r>
+      <w:r>
+        <w:rPr>
+          <w:b w:val="0"/>
+        </w:rPr>
+        <w:t xml:space="preserve">. </w:t>
+      </w:r>
+      <w:r>
+        <w:rPr>
+          <w:b w:val="0"/>
+          <w:highlight w:val="yellow"/>
+        </w:rPr>
+        <w:t>Varje punkt anger vilken fråga och vilket lagrum den gäller, och slutar med vad LNF begär att VA SYD redovisar.</w:t>
       </w:r>
     </w:p>
     <w:p>

</xml_diff>